<commit_message>
Update Team page design instructions: add Founder Traits section
New section: 11 cognitive/perceptual traits as tag chips
Visual spec: rounded corners, purple border, uppercase, wrap naturally
Explanatory note connects traits to hiring philosophy
Reusable component: same tag chip design for Careers page job postings
ATS integration: candidates self-identify traits using same component
WHAT NOT TO DO guidance included
</commit_message>
<xml_diff>
--- a/website/AUDACION_TEAM_PAGE_DESIGN_INSTRUCTIONS.docx
+++ b/website/AUDACION_TEAM_PAGE_DESIGN_INSTRUCTIONS.docx
@@ -687,6 +687,176 @@
           <w:szCs w:val="22"/>
         </w:rPr>
         <w:t xml:space="preserve">Three links below the bio: "Connect with Dee on LinkedIn," "Contact Dee directly," "Read the full Audacion AI Labs story." Styled as text links in Audacion purple, not buttons. Centered.</w:t>
+      </w:r>
+    </w:p>
+    <w:p>
+      <w:pPr>
+        <w:spacing w:after="80" w:before="300"/>
+      </w:pPr>
+      <w:r>
+        <w:rPr>
+          <w:rFonts w:ascii="Arial" w:cs="Arial" w:eastAsia="Arial" w:hAnsi="Arial"/>
+          <w:b/>
+          <w:bCs/>
+          <w:color w:val="6C3483"/>
+          <w:sz w:val="26"/>
+          <w:szCs w:val="26"/>
+        </w:rPr>
+        <w:t xml:space="preserve">FOUNDER TRAITS (NEW SECTION — add between bio links and Section 3)</w:t>
+      </w:r>
+    </w:p>
+    <w:p>
+      <w:pPr>
+        <w:spacing w:after="80"/>
+      </w:pPr>
+      <w:r>
+        <w:rPr>
+          <w:rFonts w:ascii="Arial" w:cs="Arial" w:eastAsia="Arial" w:hAnsi="Arial"/>
+          <w:sz w:val="22"/>
+          <w:szCs w:val="22"/>
+        </w:rPr>
+        <w:t xml:space="preserve">Below the bio links and above SECTION 3 (Founding Team), add a new visual element: the founder’s cognitive and perceptual traits displayed as tag chips.</w:t>
+      </w:r>
+    </w:p>
+    <w:p>
+      <w:pPr>
+        <w:spacing w:after="60" w:before="120"/>
+      </w:pPr>
+      <w:r>
+        <w:rPr>
+          <w:rFonts w:ascii="Arial" w:cs="Arial" w:eastAsia="Arial" w:hAnsi="Arial"/>
+          <w:b/>
+          <w:bCs/>
+          <w:sz w:val="22"/>
+          <w:szCs w:val="22"/>
+        </w:rPr>
+        <w:t xml:space="preserve">THE 11 TRAITS (in this exact order):</w:t>
+      </w:r>
+    </w:p>
+    <w:p>
+      <w:pPr>
+        <w:spacing w:after="80"/>
+      </w:pPr>
+      <w:r>
+        <w:rPr>
+          <w:rFonts w:ascii="Arial" w:cs="Arial" w:eastAsia="Arial" w:hAnsi="Arial"/>
+          <w:sz w:val="22"/>
+          <w:szCs w:val="22"/>
+        </w:rPr>
+        <w:t xml:space="preserve">Polymath · Advanced Integrative Thinker · Critical Thinker · Highly Associative Thinker · Advanced Emotional Perception · Emotional Intelligence · Conceptual Intelligence · Strong Interdisciplinary Cognition · Conceptual Fluidity · Essence-Based Identity · Somatic Attunement</w:t>
+      </w:r>
+    </w:p>
+    <w:p>
+      <w:pPr>
+        <w:spacing w:after="60" w:before="120"/>
+      </w:pPr>
+      <w:r>
+        <w:rPr>
+          <w:rFonts w:ascii="Arial" w:cs="Arial" w:eastAsia="Arial" w:hAnsi="Arial"/>
+          <w:b/>
+          <w:bCs/>
+          <w:sz w:val="22"/>
+          <w:szCs w:val="22"/>
+        </w:rPr>
+        <w:t xml:space="preserve">VISUAL TREATMENT:</w:t>
+      </w:r>
+    </w:p>
+    <w:p>
+      <w:pPr>
+        <w:spacing w:after="60"/>
+      </w:pPr>
+      <w:r>
+        <w:rPr>
+          <w:rFonts w:ascii="Arial" w:cs="Arial" w:eastAsia="Arial" w:hAnsi="Arial"/>
+          <w:sz w:val="22"/>
+          <w:szCs w:val="22"/>
+        </w:rPr>
+        <w:t xml:space="preserve">Display each trait as a horizontal TAG or CHIP. Similar to how GitHub shows topic tags or how LinkedIn shows skills. Each tag: rounded corners (border-radius 20px), 1px border in Audacion purple (#6C3483) at 40% opacity, transparent or very slight purple tint background (rgba(108, 52, 131, 0.08)), text in 12px to 13px uppercase with wide letter-spacing (0.05em to 0.08em), color white or light gray (#E0E0E0). Tags should wrap naturally into multiple rows. Centered within max-width 720px container. Horizontal gap between tags: 8px to 10px. Vertical gap between rows: 8px to 10px. The overall effect should feel like a professional skills profile, not a bullet list.</w:t>
+      </w:r>
+    </w:p>
+    <w:p>
+      <w:pPr>
+        <w:spacing w:after="60" w:before="120"/>
+      </w:pPr>
+      <w:r>
+        <w:rPr>
+          <w:rFonts w:ascii="Arial" w:cs="Arial" w:eastAsia="Arial" w:hAnsi="Arial"/>
+          <w:b/>
+          <w:bCs/>
+          <w:sz w:val="22"/>
+          <w:szCs w:val="22"/>
+        </w:rPr>
+        <w:t xml:space="preserve">EXPLANATORY NOTE BELOW THE TAGS:</w:t>
+      </w:r>
+    </w:p>
+    <w:p>
+      <w:pPr>
+        <w:spacing w:after="60"/>
+      </w:pPr>
+      <w:r>
+        <w:rPr>
+          <w:rFonts w:ascii="Arial" w:cs="Arial" w:eastAsia="Arial" w:hAnsi="Arial"/>
+          <w:sz w:val="22"/>
+          <w:szCs w:val="22"/>
+        </w:rPr>
+        <w:t xml:space="preserve">Below the tags, add this text in 14px italic, #BDC3C7, max-width 600px, centered: “These traits are not decorative. They describe the cognitive and perceptual capabilities that produced the research. When we hire, we look for people who carry these qualities. Our application process includes a section where candidates identify their own cognitive traits. The research requires people who think this way.”</w:t>
+      </w:r>
+    </w:p>
+    <w:p>
+      <w:pPr>
+        <w:spacing w:after="60" w:before="120"/>
+      </w:pPr>
+      <w:r>
+        <w:rPr>
+          <w:rFonts w:ascii="Arial" w:cs="Arial" w:eastAsia="Arial" w:hAnsi="Arial"/>
+          <w:b/>
+          <w:bCs/>
+          <w:sz w:val="22"/>
+          <w:szCs w:val="22"/>
+        </w:rPr>
+        <w:t xml:space="preserve">WHY THIS MATTERS FOR THE CAREERS PAGE:</w:t>
+      </w:r>
+    </w:p>
+    <w:p>
+      <w:pPr>
+        <w:spacing w:after="80"/>
+      </w:pPr>
+      <w:r>
+        <w:rPr>
+          <w:rFonts w:ascii="Arial" w:cs="Arial" w:eastAsia="Arial" w:hAnsi="Arial"/>
+          <w:sz w:val="22"/>
+          <w:szCs w:val="22"/>
+        </w:rPr>
+        <w:t xml:space="preserve">This exact tag/chip component will be REUSED on the Careers page. Each job posting will include a “Cognitive Traits” section showing the traits required for that role (selected from a master list that includes these 11 plus others). When candidates apply, they self-identify their own traits using the same visual component. The ATS backend will use trait matching to surface strong-fit candidates. Build the tag component as a reusable element now so it works on both Team and Careers pages.</w:t>
+      </w:r>
+    </w:p>
+    <w:p>
+      <w:pPr>
+        <w:spacing w:after="60" w:before="120"/>
+      </w:pPr>
+      <w:r>
+        <w:rPr>
+          <w:rFonts w:ascii="Arial" w:cs="Arial" w:eastAsia="Arial" w:hAnsi="Arial"/>
+          <w:b/>
+          <w:bCs/>
+          <w:color w:val="C0392B"/>
+          <w:sz w:val="22"/>
+          <w:szCs w:val="22"/>
+        </w:rPr>
+        <w:t xml:space="preserve">WHAT NOT TO DO:</w:t>
+      </w:r>
+    </w:p>
+    <w:p>
+      <w:pPr>
+        <w:spacing w:after="60"/>
+      </w:pPr>
+      <w:r>
+        <w:rPr>
+          <w:rFonts w:ascii="Arial" w:cs="Arial" w:eastAsia="Arial" w:hAnsi="Arial"/>
+          <w:sz w:val="22"/>
+          <w:szCs w:val="22"/>
+        </w:rPr>
+        <w:t xml:space="preserve">Do NOT display these as a bullet list. Do NOT make them bold text in a paragraph. Do NOT use colored backgrounds that compete with PRISM colors. Do NOT make the tags clickable (they are descriptors, not links). Do NOT add icons to individual tags. The tags should feel clean, understated, and professional. Think LinkedIn skills section, not Pinterest interest board.</w:t>
       </w:r>
     </w:p>
     <w:p>

</xml_diff>